<commit_message>
Deploy preview for PR 110 🛫
</commit_message>
<xml_diff>
--- a/pr-preview/pr-110/chapters/10-random-variability-tracked-changes.docx
+++ b/pr-preview/pr-110/chapters/10-random-variability-tracked-changes.docx
@@ -3541,25 +3541,61 @@
               <w:t xml:space="preserve"> (Coverage over repeated studies). </w:t>
             </w:r>
             <w:r>
-              <w:t xml:space="preserve">Validity is a statement about coverage over repeated samples from the super-population.</w:t>
-            </w:r>
-            <w:r>
-              <w:t xml:space="preserve"> </w:t>
-            </w:r>
-            <w:r>
-              <w:t xml:space="preserve">Picture every study that we and other researchers will ever run, each reporting a valid 95% interval.</w:t>
-            </w:r>
-            <w:r>
-              <w:t xml:space="preserve"> </w:t>
-            </w:r>
-            <w:r>
-              <w:t xml:space="preserve">Looking back over that whole collection, at least 95% of the intervals would contain their targets,</w:t>
-            </w:r>
-            <w:r>
-              <w:t xml:space="preserve"> </w:t>
-            </w:r>
-            <w:r>
-              <w:t xml:space="preserve">but nothing in the data would reveal which intervals, at most 5% of them, missed.</w:t>
+              <w:t xml:space="preserve">Validity is a property of the interval procedure, not of any one interval:</w:t>
+            </w:r>
+            <w:r>
+              <w:t xml:space="preserve"> </w:t>
+            </w:r>
+            <w:r>
+              <w:t xml:space="preserve">over repeated samples from the super-population,</w:t>
+            </w:r>
+            <w:r>
+              <w:t xml:space="preserve"> </w:t>
+            </w:r>
+            <w:r>
+              <w:t xml:space="preserve">the procedure covers its target with probability at least 95%.</w:t>
+            </w:r>
+            <w:r>
+              <w:t xml:space="preserve"> </w:t>
+            </w:r>
+            <w:r>
+              <w:t xml:space="preserve">Picture every study that we and other researchers will ever run,</w:t>
+            </w:r>
+            <w:r>
+              <w:t xml:space="preserve"> </w:t>
+            </w:r>
+            <w:r>
+              <w:t xml:space="preserve">each using a 95% procedure that is small-sample valid.</w:t>
+            </w:r>
+            <w:r>
+              <w:t xml:space="preserve"> </w:t>
+            </w:r>
+            <w:r>
+              <w:t xml:space="preserve">If we idealize that collection as an unending sequence,</w:t>
+            </w:r>
+            <w:r>
+              <w:t xml:space="preserve"> </w:t>
+            </w:r>
+            <w:r>
+              <w:t xml:space="preserve">the share of those intervals that contain their targets would be at least 95%.</w:t>
+            </w:r>
+            <w:r>
+              <w:t xml:space="preserve"> </w:t>
+            </w:r>
+            <w:r>
+              <w:t xml:space="preserve">For the book’s large-sample valid intervals, such as Wald intervals, this guarantee holds only in the limit as samples grow;</w:t>
+            </w:r>
+            <w:r>
+              <w:t xml:space="preserve"> </w:t>
+            </w:r>
+            <w:r>
+              <w:t xml:space="preserve">at a given sample size their coverage can fall well short of 95%.</w:t>
+            </w:r>
+            <w:r>
+              <w:t xml:space="preserve"> </w:t>
+            </w:r>
+            <w:r>
+              <w:t xml:space="preserve">In every case, nothing in the data would reveal which intervals missed.</w:t>
             </w:r>
           </w:p>
           <w:bookmarkEnd w:id="32"/>
@@ -10612,7 +10648,25 @@
               <w:t xml:space="preserve"> </w:t>
             </w:r>
             <w:r>
-              <w:t xml:space="preserve">and the binomial interval is not calibrated but</w:t>
+              <w:t xml:space="preserve">and the binomial Wald interval is not asymptotically calibrated.</w:t>
+            </w:r>
+            <w:r>
+              <w:t xml:space="preserve"> </w:t>
+            </w:r>
+            <w:r>
+              <w:t xml:space="preserve">As the number of individuals grows,</w:t>
+            </w:r>
+            <w:r>
+              <w:t xml:space="preserve"> </w:t>
+            </w:r>
+            <w:r>
+              <w:t xml:space="preserve">with risks whose spread does not shrink to zero,</w:t>
+            </w:r>
+            <w:r>
+              <w:t xml:space="preserve"> </w:t>
+            </w:r>
+            <w:r>
+              <w:t xml:space="preserve">it is asymptotically</w:t>
             </w:r>
             <w:r>
               <w:t xml:space="preserve"> </w:t>
@@ -10625,13 +10679,13 @@
               <w:t xml:space="preserve">conservative</w:t>
             </w:r>
             <w:r>
-              <w:t xml:space="preserve">:</w:t>
-            </w:r>
-            <w:r>
-              <w:t xml:space="preserve"> </w:t>
-            </w:r>
-            <w:r>
-              <w:t xml:space="preserve">by</w:t>
+              <w:t xml:space="preserve">: its coverage stays above 95% in the limit.</w:t>
+            </w:r>
+            <w:r>
+              <w:t xml:space="preserve"> </w:t>
+            </w:r>
+            <w:r>
+              <w:t xml:space="preserve">By</w:t>
             </w:r>
             <w:r>
               <w:t xml:space="preserve"> </w:t>
@@ -10654,7 +10708,7 @@
               <w:t xml:space="preserve"> </w:t>
             </w:r>
             <w:r>
-              <w:t xml:space="preserve">so the interval is too wide.</w:t>
+              <w:t xml:space="preserve">so under the normal approximation the interval is too wide.</w:t>
             </w:r>
           </w:p>
           <w:bookmarkEnd w:id="63"/>

</xml_diff>